<commit_message>
feat: menambah jadwal pemeriksaan di Role It dan direksi
</commit_message>
<xml_diff>
--- a/storage/templates/pengajuan-budget-operational.docx
+++ b/storage/templates/pengajuan-budget-operational.docx
@@ -1,6 +1,6 @@
 
 <file path=word/document.xml><?xml version="1.0" encoding="utf-8"?>
-<w:document xmlns:wpc="http://schemas.microsoft.com/office/word/2010/wordprocessingCanvas" xmlns:cx="http://schemas.microsoft.com/office/drawing/2014/chartex" xmlns:cx1="http://schemas.microsoft.com/office/drawing/2015/9/8/chartex" xmlns:cx2="http://schemas.microsoft.com/office/drawing/2015/10/21/chartex" xmlns:cx3="http://schemas.microsoft.com/office/drawing/2016/5/9/chartex" xmlns:cx4="http://schemas.microsoft.com/office/drawing/2016/5/10/chartex" xmlns:cx5="http://schemas.microsoft.com/office/drawing/2016/5/11/chartex" xmlns:cx6="http://schemas.microsoft.com/office/drawing/2016/5/12/chartex" xmlns:cx7="http://schemas.microsoft.com/office/drawing/2016/5/13/chartex" xmlns:cx8="http://schemas.microsoft.com/office/drawing/2016/5/14/chartex" xmlns:mc="http://schemas.openxmlformats.org/markup-compatibility/2006" xmlns:aink="http://schemas.microsoft.com/office/drawing/2016/ink" xmlns:am3d="http://schemas.microsoft.com/office/drawing/2017/model3d" xmlns:o="urn:schemas-microsoft-com:office:office" xmlns:oel="http://schemas.microsoft.com/office/2019/extlst" xmlns:r="http://schemas.openxmlformats.org/officeDocument/2006/relationships" xmlns:m="http://schemas.openxmlformats.org/officeDocument/2006/math" xmlns:v="urn:schemas-microsoft-com:vml" xmlns:wp14="http://schemas.microsoft.com/office/word/2010/wordprocessingDrawing" xmlns:wp="http://schemas.openxmlformats.org/drawingml/2006/wordprocessingDrawing" xmlns:w10="urn:schemas-microsoft-com:office:word" xmlns:w="http://schemas.openxmlformats.org/wordprocessingml/2006/main" xmlns:w14="http://schemas.microsoft.com/office/word/2010/wordml" xmlns:w15="http://schemas.microsoft.com/office/word/2012/wordml" xmlns:w16cei="http://schemas.microsoft.com/office/word/2026/wordml/cei" xmlns:w16cex="http://schemas.microsoft.com/office/word/2018/wordml/cex" xmlns:w16cid="http://schemas.microsoft.com/office/word/2016/wordml/cid" xmlns:w16="http://schemas.microsoft.com/office/word/2018/wordml" xmlns:w16du="http://schemas.microsoft.com/office/word/2023/wordml/word16du" xmlns:w16sdtdh="http://schemas.microsoft.com/office/word/2020/wordml/sdtdatahash" xmlns:w16sdtfl="http://schemas.microsoft.com/office/word/2024/wordml/sdtformatlock" xmlns:w16se="http://schemas.microsoft.com/office/word/2015/wordml/symex" xmlns:wpg="http://schemas.microsoft.com/office/word/2010/wordprocessingGroup" xmlns:wpi="http://schemas.microsoft.com/office/word/2010/wordprocessingInk" xmlns:wne="http://schemas.microsoft.com/office/word/2006/wordml" xmlns:wps="http://schemas.microsoft.com/office/word/2010/wordprocessingShape" mc:Ignorable="w14 w15 w16se w16cid w16 w16cex w16sdtdh w16sdtfl w16du wp14">
+<w:document xmlns:wpc="http://schemas.microsoft.com/office/word/2010/wordprocessingCanvas" xmlns:cx="http://schemas.microsoft.com/office/drawing/2014/chartex" xmlns:cx1="http://schemas.microsoft.com/office/drawing/2015/9/8/chartex" xmlns:cx2="http://schemas.microsoft.com/office/drawing/2015/10/21/chartex" xmlns:cx3="http://schemas.microsoft.com/office/drawing/2016/5/9/chartex" xmlns:cx4="http://schemas.microsoft.com/office/drawing/2016/5/10/chartex" xmlns:cx5="http://schemas.microsoft.com/office/drawing/2016/5/11/chartex" xmlns:cx6="http://schemas.microsoft.com/office/drawing/2016/5/12/chartex" xmlns:cx7="http://schemas.microsoft.com/office/drawing/2016/5/13/chartex" xmlns:cx8="http://schemas.microsoft.com/office/drawing/2016/5/14/chartex" xmlns:mc="http://schemas.openxmlformats.org/markup-compatibility/2006" xmlns:aink="http://schemas.microsoft.com/office/drawing/2016/ink" xmlns:am3d="http://schemas.microsoft.com/office/drawing/2017/model3d" xmlns:o="urn:schemas-microsoft-com:office:office" xmlns:oel="http://schemas.microsoft.com/office/2019/extlst" xmlns:r="http://schemas.openxmlformats.org/officeDocument/2006/relationships" xmlns:m="http://schemas.openxmlformats.org/officeDocument/2006/math" xmlns:v="urn:schemas-microsoft-com:vml" xmlns:wp14="http://schemas.microsoft.com/office/word/2010/wordprocessingDrawing" xmlns:wp="http://schemas.openxmlformats.org/drawingml/2006/wordprocessingDrawing" xmlns:w10="urn:schemas-microsoft-com:office:word" xmlns:w="http://schemas.openxmlformats.org/wordprocessingml/2006/main" xmlns:w14="http://schemas.microsoft.com/office/word/2010/wordml" xmlns:w15="http://schemas.microsoft.com/office/word/2012/wordml" xmlns:w16cex="http://schemas.microsoft.com/office/word/2018/wordml/cex" xmlns:w16cid="http://schemas.microsoft.com/office/word/2016/wordml/cid" xmlns:w16="http://schemas.microsoft.com/office/word/2018/wordml" xmlns:w16du="http://schemas.microsoft.com/office/word/2023/wordml/word16du" xmlns:w16sdtdh="http://schemas.microsoft.com/office/word/2020/wordml/sdtdatahash" xmlns:w16sdtfl="http://schemas.microsoft.com/office/word/2024/wordml/sdtformatlock" xmlns:w16se="http://schemas.microsoft.com/office/word/2015/wordml/symex" xmlns:wpg="http://schemas.microsoft.com/office/word/2010/wordprocessingGroup" xmlns:wpi="http://schemas.microsoft.com/office/word/2010/wordprocessingInk" xmlns:wne="http://schemas.microsoft.com/office/word/2006/wordml" xmlns:wps="http://schemas.microsoft.com/office/word/2010/wordprocessingShape" mc:Ignorable="w14 w15 w16se w16cid w16 w16cex w16sdtdh w16sdtfl w16du wp14">
   <w:body>
     <w:p>
       <w:pPr>
@@ -15,7 +15,7 @@
           <w:sz w:val="20"/>
         </w:rPr>
         <w:drawing>
-          <wp:anchor distT="0" distB="0" distL="0" distR="0" simplePos="0" relativeHeight="251656192" behindDoc="0" locked="0" layoutInCell="1" allowOverlap="1" wp14:anchorId="389C8A68" wp14:editId="68768302">
+          <wp:anchor distT="0" distB="0" distL="0" distR="0" simplePos="0" relativeHeight="251655680" behindDoc="0" locked="0" layoutInCell="1" allowOverlap="1" wp14:anchorId="389C8A68" wp14:editId="68768302">
             <wp:simplePos x="0" y="0"/>
             <wp:positionH relativeFrom="page">
               <wp:posOffset>214884</wp:posOffset>
@@ -205,22 +205,7 @@
                 <w:b/>
                 <w:sz w:val="24"/>
               </w:rPr>
-              <w:t>OPERATIONAL</w:t>
-            </w:r>
-            <w:r>
-              <w:rPr>
-                <w:b/>
-                <w:sz w:val="24"/>
-              </w:rPr>
-              <w:t xml:space="preserve"> </w:t>
-            </w:r>
-            <w:r>
-              <w:rPr>
-                <w:b/>
-                <w:sz w:val="24"/>
-                <w:lang w:val="id-ID"/>
-              </w:rPr>
-              <w:t>RIKSA UJI</w:t>
+              <w:t>${nama_pengajuan_budget}</w:t>
             </w:r>
           </w:p>
         </w:tc>
@@ -2318,7 +2303,7 @@
         <mc:AlternateContent>
           <mc:Choice Requires="wps">
             <w:drawing>
-              <wp:anchor distT="0" distB="0" distL="0" distR="0" simplePos="0" relativeHeight="251657216" behindDoc="1" locked="0" layoutInCell="1" allowOverlap="1" wp14:anchorId="792E342A" wp14:editId="7C941D8D">
+              <wp:anchor distT="0" distB="0" distL="0" distR="0" simplePos="0" relativeHeight="251657728" behindDoc="1" locked="0" layoutInCell="1" allowOverlap="1" wp14:anchorId="792E342A" wp14:editId="7C941D8D">
                 <wp:simplePos x="0" y="0"/>
                 <wp:positionH relativeFrom="page">
                   <wp:posOffset>375158</wp:posOffset>
@@ -2481,7 +2466,7 @@
                 <v:stroke joinstyle="miter"/>
                 <v:path gradientshapeok="t" o:connecttype="rect"/>
               </v:shapetype>
-              <v:shape id="Textbox 4" o:spid="_x0000_s1026" type="#_x0000_t202" style="position:absolute;margin-left:29.55pt;margin-top:18.4pt;width:126.95pt;height:23pt;z-index:-251659264;visibility:visible;mso-wrap-style:square;mso-wrap-distance-left:0;mso-wrap-distance-top:0;mso-wrap-distance-right:0;mso-wrap-distance-bottom:0;mso-position-horizontal:absolute;mso-position-horizontal-relative:page;mso-position-vertical:absolute;mso-position-vertical-relative:text;v-text-anchor:top" o:gfxdata="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" filled="f" stroked="f">
+              <v:shape id="Textbox 4" o:spid="_x0000_s1026" type="#_x0000_t202" style="position:absolute;margin-left:29.55pt;margin-top:18.4pt;width:126.95pt;height:23pt;z-index:-251658752;visibility:visible;mso-wrap-style:square;mso-wrap-distance-left:0;mso-wrap-distance-top:0;mso-wrap-distance-right:0;mso-wrap-distance-bottom:0;mso-position-horizontal:absolute;mso-position-horizontal-relative:page;mso-position-vertical:absolute;mso-position-vertical-relative:text;v-text-anchor:top" o:gfxdata="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" filled="f" stroked="f">
                 <v:textbox inset="0,0,0,0">
                   <w:txbxContent>
                     <w:tbl>
@@ -2614,7 +2599,7 @@
         <mc:AlternateContent>
           <mc:Choice Requires="wps">
             <w:drawing>
-              <wp:anchor distT="0" distB="0" distL="0" distR="0" simplePos="0" relativeHeight="251660288" behindDoc="1" locked="0" layoutInCell="1" allowOverlap="1" wp14:anchorId="593E9272" wp14:editId="508512BA">
+              <wp:anchor distT="0" distB="0" distL="0" distR="0" simplePos="0" relativeHeight="251658752" behindDoc="1" locked="0" layoutInCell="1" allowOverlap="1" wp14:anchorId="593E9272" wp14:editId="508512BA">
                 <wp:simplePos x="0" y="0"/>
                 <wp:positionH relativeFrom="page">
                   <wp:posOffset>5597271</wp:posOffset>
@@ -2789,7 +2774,7 @@
           </mc:Choice>
           <mc:Fallback>
             <w:pict>
-              <v:shape w14:anchorId="593E9272" id="Textbox 5" o:spid="_x0000_s1027" type="#_x0000_t202" style="position:absolute;margin-left:440.75pt;margin-top:18.4pt;width:119pt;height:23pt;z-index:-251656192;visibility:visible;mso-wrap-style:square;mso-wrap-distance-left:0;mso-wrap-distance-top:0;mso-wrap-distance-right:0;mso-wrap-distance-bottom:0;mso-position-horizontal:absolute;mso-position-horizontal-relative:page;mso-position-vertical:absolute;mso-position-vertical-relative:text;v-text-anchor:top" o:gfxdata="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" filled="f" stroked="f">
+              <v:shape w14:anchorId="593E9272" id="Textbox 5" o:spid="_x0000_s1027" type="#_x0000_t202" style="position:absolute;margin-left:440.75pt;margin-top:18.4pt;width:119pt;height:23pt;z-index:-251657728;visibility:visible;mso-wrap-style:square;mso-wrap-distance-left:0;mso-wrap-distance-top:0;mso-wrap-distance-right:0;mso-wrap-distance-bottom:0;mso-position-horizontal:absolute;mso-position-horizontal-relative:page;mso-position-vertical:absolute;mso-position-vertical-relative:text;v-text-anchor:top" o:gfxdata="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" filled="f" stroked="f">
                 <v:textbox inset="0,0,0,0">
                   <w:txbxContent>
                     <w:tbl>
@@ -2967,7 +2952,7 @@
         <mc:AlternateContent>
           <mc:Choice Requires="wps">
             <w:drawing>
-              <wp:anchor distT="0" distB="0" distL="0" distR="0" simplePos="0" relativeHeight="251656192" behindDoc="0" locked="0" layoutInCell="1" allowOverlap="1" wp14:anchorId="258CCBA7" wp14:editId="0B65FFCC">
+              <wp:anchor distT="0" distB="0" distL="0" distR="0" simplePos="0" relativeHeight="251656704" behindDoc="0" locked="0" layoutInCell="1" allowOverlap="1" wp14:anchorId="258CCBA7" wp14:editId="0B65FFCC">
                 <wp:simplePos x="0" y="0"/>
                 <wp:positionH relativeFrom="page">
                   <wp:posOffset>551180</wp:posOffset>
@@ -3125,7 +3110,7 @@
           </mc:Choice>
           <mc:Fallback>
             <w:pict>
-              <v:shape w14:anchorId="258CCBA7" id="Textbox 3" o:spid="_x0000_s1028" type="#_x0000_t202" style="position:absolute;left:0;text-align:left;margin-left:43.4pt;margin-top:702.35pt;width:101.85pt;height:22.9pt;z-index:251656192;visibility:visible;mso-wrap-style:square;mso-wrap-distance-left:0;mso-wrap-distance-top:0;mso-wrap-distance-right:0;mso-wrap-distance-bottom:0;mso-position-horizontal:absolute;mso-position-horizontal-relative:page;mso-position-vertical:absolute;mso-position-vertical-relative:page;v-text-anchor:top" o:gfxdata="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" filled="f" stroked="f">
+              <v:shape w14:anchorId="258CCBA7" id="Textbox 3" o:spid="_x0000_s1028" type="#_x0000_t202" style="position:absolute;left:0;text-align:left;margin-left:43.4pt;margin-top:702.35pt;width:101.85pt;height:22.9pt;z-index:251656704;visibility:visible;mso-wrap-style:square;mso-wrap-distance-left:0;mso-wrap-distance-top:0;mso-wrap-distance-right:0;mso-wrap-distance-bottom:0;mso-position-horizontal:absolute;mso-position-horizontal-relative:page;mso-position-vertical:absolute;mso-position-vertical-relative:page;v-text-anchor:top" o:gfxdata="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" filled="f" stroked="f">
                 <v:textbox inset="0,0,0,0">
                   <w:txbxContent>
                     <w:tbl>
@@ -3257,7 +3242,7 @@
         <mc:AlternateContent>
           <mc:Choice Requires="wps">
             <w:drawing>
-              <wp:anchor distT="0" distB="0" distL="0" distR="0" simplePos="0" relativeHeight="251661312" behindDoc="1" locked="0" layoutInCell="1" allowOverlap="1" wp14:anchorId="75020C2C" wp14:editId="6C0CA55C">
+              <wp:anchor distT="0" distB="0" distL="0" distR="0" simplePos="0" relativeHeight="251659776" behindDoc="1" locked="0" layoutInCell="1" allowOverlap="1" wp14:anchorId="75020C2C" wp14:editId="6C0CA55C">
                 <wp:simplePos x="0" y="0"/>
                 <wp:positionH relativeFrom="page">
                   <wp:posOffset>5796280</wp:posOffset>
@@ -3435,7 +3420,7 @@
           </mc:Choice>
           <mc:Fallback>
             <w:pict>
-              <v:shape w14:anchorId="75020C2C" id="Textbox 1" o:spid="_x0000_s1029" type="#_x0000_t202" style="position:absolute;left:0;text-align:left;margin-left:456.4pt;margin-top:702.6pt;width:109.5pt;height:22.9pt;z-index:-251655168;visibility:visible;mso-wrap-style:square;mso-wrap-distance-left:0;mso-wrap-distance-top:0;mso-wrap-distance-right:0;mso-wrap-distance-bottom:0;mso-position-horizontal:absolute;mso-position-horizontal-relative:page;mso-position-vertical:absolute;mso-position-vertical-relative:page;v-text-anchor:top" o:gfxdata="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" filled="f" stroked="f">
+              <v:shape w14:anchorId="75020C2C" id="Textbox 1" o:spid="_x0000_s1029" type="#_x0000_t202" style="position:absolute;left:0;text-align:left;margin-left:456.4pt;margin-top:702.6pt;width:109.5pt;height:22.9pt;z-index:-251656704;visibility:visible;mso-wrap-style:square;mso-wrap-distance-left:0;mso-wrap-distance-top:0;mso-wrap-distance-right:0;mso-wrap-distance-bottom:0;mso-position-horizontal:absolute;mso-position-horizontal-relative:page;mso-position-vertical:absolute;mso-position-vertical-relative:page;v-text-anchor:top" o:gfxdata="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" filled="f" stroked="f">
                 <v:textbox inset="0,0,0,0">
                   <w:txbxContent>
                     <w:tbl>
@@ -3586,7 +3571,7 @@
 </file>
 
 <file path=word/endnotes.xml><?xml version="1.0" encoding="utf-8"?>
-<w:endnotes xmlns:wpc="http://schemas.microsoft.com/office/word/2010/wordprocessingCanvas" xmlns:cx="http://schemas.microsoft.com/office/drawing/2014/chartex" xmlns:cx1="http://schemas.microsoft.com/office/drawing/2015/9/8/chartex" xmlns:cx2="http://schemas.microsoft.com/office/drawing/2015/10/21/chartex" xmlns:cx3="http://schemas.microsoft.com/office/drawing/2016/5/9/chartex" xmlns:cx4="http://schemas.microsoft.com/office/drawing/2016/5/10/chartex" xmlns:cx5="http://schemas.microsoft.com/office/drawing/2016/5/11/chartex" xmlns:cx6="http://schemas.microsoft.com/office/drawing/2016/5/12/chartex" xmlns:cx7="http://schemas.microsoft.com/office/drawing/2016/5/13/chartex" xmlns:cx8="http://schemas.microsoft.com/office/drawing/2016/5/14/chartex" xmlns:mc="http://schemas.openxmlformats.org/markup-compatibility/2006" xmlns:aink="http://schemas.microsoft.com/office/drawing/2016/ink" xmlns:am3d="http://schemas.microsoft.com/office/drawing/2017/model3d" xmlns:o="urn:schemas-microsoft-com:office:office" xmlns:oel="http://schemas.microsoft.com/office/2019/extlst" xmlns:r="http://schemas.openxmlformats.org/officeDocument/2006/relationships" xmlns:m="http://schemas.openxmlformats.org/officeDocument/2006/math" xmlns:v="urn:schemas-microsoft-com:vml" xmlns:wp14="http://schemas.microsoft.com/office/word/2010/wordprocessingDrawing" xmlns:wp="http://schemas.openxmlformats.org/drawingml/2006/wordprocessingDrawing" xmlns:w10="urn:schemas-microsoft-com:office:word" xmlns:w="http://schemas.openxmlformats.org/wordprocessingml/2006/main" xmlns:w14="http://schemas.microsoft.com/office/word/2010/wordml" xmlns:w15="http://schemas.microsoft.com/office/word/2012/wordml" xmlns:w16cei="http://schemas.microsoft.com/office/word/2026/wordml/cei" xmlns:w16cex="http://schemas.microsoft.com/office/word/2018/wordml/cex" xmlns:w16cid="http://schemas.microsoft.com/office/word/2016/wordml/cid" xmlns:w16="http://schemas.microsoft.com/office/word/2018/wordml" xmlns:w16du="http://schemas.microsoft.com/office/word/2023/wordml/word16du" xmlns:w16sdtdh="http://schemas.microsoft.com/office/word/2020/wordml/sdtdatahash" xmlns:w16sdtfl="http://schemas.microsoft.com/office/word/2024/wordml/sdtformatlock" xmlns:w16se="http://schemas.microsoft.com/office/word/2015/wordml/symex" xmlns:wpg="http://schemas.microsoft.com/office/word/2010/wordprocessingGroup" xmlns:wpi="http://schemas.microsoft.com/office/word/2010/wordprocessingInk" xmlns:wne="http://schemas.microsoft.com/office/word/2006/wordml" xmlns:wps="http://schemas.microsoft.com/office/word/2010/wordprocessingShape" mc:Ignorable="w14 w15 w16se w16cid w16 w16cex w16sdtdh w16sdtfl w16du wp14">
+<w:endnotes xmlns:wpc="http://schemas.microsoft.com/office/word/2010/wordprocessingCanvas" xmlns:cx="http://schemas.microsoft.com/office/drawing/2014/chartex" xmlns:cx1="http://schemas.microsoft.com/office/drawing/2015/9/8/chartex" xmlns:cx2="http://schemas.microsoft.com/office/drawing/2015/10/21/chartex" xmlns:cx3="http://schemas.microsoft.com/office/drawing/2016/5/9/chartex" xmlns:cx4="http://schemas.microsoft.com/office/drawing/2016/5/10/chartex" xmlns:cx5="http://schemas.microsoft.com/office/drawing/2016/5/11/chartex" xmlns:cx6="http://schemas.microsoft.com/office/drawing/2016/5/12/chartex" xmlns:cx7="http://schemas.microsoft.com/office/drawing/2016/5/13/chartex" xmlns:cx8="http://schemas.microsoft.com/office/drawing/2016/5/14/chartex" xmlns:mc="http://schemas.openxmlformats.org/markup-compatibility/2006" xmlns:aink="http://schemas.microsoft.com/office/drawing/2016/ink" xmlns:am3d="http://schemas.microsoft.com/office/drawing/2017/model3d" xmlns:o="urn:schemas-microsoft-com:office:office" xmlns:oel="http://schemas.microsoft.com/office/2019/extlst" xmlns:r="http://schemas.openxmlformats.org/officeDocument/2006/relationships" xmlns:m="http://schemas.openxmlformats.org/officeDocument/2006/math" xmlns:v="urn:schemas-microsoft-com:vml" xmlns:wp14="http://schemas.microsoft.com/office/word/2010/wordprocessingDrawing" xmlns:wp="http://schemas.openxmlformats.org/drawingml/2006/wordprocessingDrawing" xmlns:w10="urn:schemas-microsoft-com:office:word" xmlns:w="http://schemas.openxmlformats.org/wordprocessingml/2006/main" xmlns:w14="http://schemas.microsoft.com/office/word/2010/wordml" xmlns:w15="http://schemas.microsoft.com/office/word/2012/wordml" xmlns:w16cex="http://schemas.microsoft.com/office/word/2018/wordml/cex" xmlns:w16cid="http://schemas.microsoft.com/office/word/2016/wordml/cid" xmlns:w16="http://schemas.microsoft.com/office/word/2018/wordml" xmlns:w16du="http://schemas.microsoft.com/office/word/2023/wordml/word16du" xmlns:w16sdtdh="http://schemas.microsoft.com/office/word/2020/wordml/sdtdatahash" xmlns:w16sdtfl="http://schemas.microsoft.com/office/word/2024/wordml/sdtformatlock" xmlns:w16se="http://schemas.microsoft.com/office/word/2015/wordml/symex" xmlns:wpg="http://schemas.microsoft.com/office/word/2010/wordprocessingGroup" xmlns:wpi="http://schemas.microsoft.com/office/word/2010/wordprocessingInk" xmlns:wne="http://schemas.microsoft.com/office/word/2006/wordml" xmlns:wps="http://schemas.microsoft.com/office/word/2010/wordprocessingShape" mc:Ignorable="w14 w15 w16se w16cid w16 w16cex w16sdtdh w16sdtfl w16du wp14">
   <w:endnote w:type="separator" w:id="-1">
     <w:p>
       <w:r>
@@ -3605,7 +3590,7 @@
 </file>
 
 <file path=word/footer1.xml><?xml version="1.0" encoding="utf-8"?>
-<w:ftr xmlns:wpc="http://schemas.microsoft.com/office/word/2010/wordprocessingCanvas" xmlns:cx="http://schemas.microsoft.com/office/drawing/2014/chartex" xmlns:cx1="http://schemas.microsoft.com/office/drawing/2015/9/8/chartex" xmlns:cx2="http://schemas.microsoft.com/office/drawing/2015/10/21/chartex" xmlns:cx3="http://schemas.microsoft.com/office/drawing/2016/5/9/chartex" xmlns:cx4="http://schemas.microsoft.com/office/drawing/2016/5/10/chartex" xmlns:cx5="http://schemas.microsoft.com/office/drawing/2016/5/11/chartex" xmlns:cx6="http://schemas.microsoft.com/office/drawing/2016/5/12/chartex" xmlns:cx7="http://schemas.microsoft.com/office/drawing/2016/5/13/chartex" xmlns:cx8="http://schemas.microsoft.com/office/drawing/2016/5/14/chartex" xmlns:mc="http://schemas.openxmlformats.org/markup-compatibility/2006" xmlns:aink="http://schemas.microsoft.com/office/drawing/2016/ink" xmlns:am3d="http://schemas.microsoft.com/office/drawing/2017/model3d" xmlns:o="urn:schemas-microsoft-com:office:office" xmlns:oel="http://schemas.microsoft.com/office/2019/extlst" xmlns:r="http://schemas.openxmlformats.org/officeDocument/2006/relationships" xmlns:m="http://schemas.openxmlformats.org/officeDocument/2006/math" xmlns:v="urn:schemas-microsoft-com:vml" xmlns:wp14="http://schemas.microsoft.com/office/word/2010/wordprocessingDrawing" xmlns:wp="http://schemas.openxmlformats.org/drawingml/2006/wordprocessingDrawing" xmlns:w10="urn:schemas-microsoft-com:office:word" xmlns:w="http://schemas.openxmlformats.org/wordprocessingml/2006/main" xmlns:w14="http://schemas.microsoft.com/office/word/2010/wordml" xmlns:w15="http://schemas.microsoft.com/office/word/2012/wordml" xmlns:w16cei="http://schemas.microsoft.com/office/word/2026/wordml/cei" xmlns:w16cex="http://schemas.microsoft.com/office/word/2018/wordml/cex" xmlns:w16cid="http://schemas.microsoft.com/office/word/2016/wordml/cid" xmlns:w16="http://schemas.microsoft.com/office/word/2018/wordml" xmlns:w16du="http://schemas.microsoft.com/office/word/2023/wordml/word16du" xmlns:w16sdtdh="http://schemas.microsoft.com/office/word/2020/wordml/sdtdatahash" xmlns:w16sdtfl="http://schemas.microsoft.com/office/word/2024/wordml/sdtformatlock" xmlns:w16se="http://schemas.microsoft.com/office/word/2015/wordml/symex" xmlns:wpg="http://schemas.microsoft.com/office/word/2010/wordprocessingGroup" xmlns:wpi="http://schemas.microsoft.com/office/word/2010/wordprocessingInk" xmlns:wne="http://schemas.microsoft.com/office/word/2006/wordml" xmlns:wps="http://schemas.microsoft.com/office/word/2010/wordprocessingShape" mc:Ignorable="w14 w15 w16se w16cid w16 w16cex w16sdtdh w16sdtfl w16du wp14">
+<w:ftr xmlns:wpc="http://schemas.microsoft.com/office/word/2010/wordprocessingCanvas" xmlns:cx="http://schemas.microsoft.com/office/drawing/2014/chartex" xmlns:cx1="http://schemas.microsoft.com/office/drawing/2015/9/8/chartex" xmlns:cx2="http://schemas.microsoft.com/office/drawing/2015/10/21/chartex" xmlns:cx3="http://schemas.microsoft.com/office/drawing/2016/5/9/chartex" xmlns:cx4="http://schemas.microsoft.com/office/drawing/2016/5/10/chartex" xmlns:cx5="http://schemas.microsoft.com/office/drawing/2016/5/11/chartex" xmlns:cx6="http://schemas.microsoft.com/office/drawing/2016/5/12/chartex" xmlns:cx7="http://schemas.microsoft.com/office/drawing/2016/5/13/chartex" xmlns:cx8="http://schemas.microsoft.com/office/drawing/2016/5/14/chartex" xmlns:mc="http://schemas.openxmlformats.org/markup-compatibility/2006" xmlns:aink="http://schemas.microsoft.com/office/drawing/2016/ink" xmlns:am3d="http://schemas.microsoft.com/office/drawing/2017/model3d" xmlns:o="urn:schemas-microsoft-com:office:office" xmlns:oel="http://schemas.microsoft.com/office/2019/extlst" xmlns:r="http://schemas.openxmlformats.org/officeDocument/2006/relationships" xmlns:m="http://schemas.openxmlformats.org/officeDocument/2006/math" xmlns:v="urn:schemas-microsoft-com:vml" xmlns:wp14="http://schemas.microsoft.com/office/word/2010/wordprocessingDrawing" xmlns:wp="http://schemas.openxmlformats.org/drawingml/2006/wordprocessingDrawing" xmlns:w10="urn:schemas-microsoft-com:office:word" xmlns:w="http://schemas.openxmlformats.org/wordprocessingml/2006/main" xmlns:w14="http://schemas.microsoft.com/office/word/2010/wordml" xmlns:w15="http://schemas.microsoft.com/office/word/2012/wordml" xmlns:w16cex="http://schemas.microsoft.com/office/word/2018/wordml/cex" xmlns:w16cid="http://schemas.microsoft.com/office/word/2016/wordml/cid" xmlns:w16="http://schemas.microsoft.com/office/word/2018/wordml" xmlns:w16du="http://schemas.microsoft.com/office/word/2023/wordml/word16du" xmlns:w16sdtdh="http://schemas.microsoft.com/office/word/2020/wordml/sdtdatahash" xmlns:w16sdtfl="http://schemas.microsoft.com/office/word/2024/wordml/sdtformatlock" xmlns:w16se="http://schemas.microsoft.com/office/word/2015/wordml/symex" xmlns:wpg="http://schemas.microsoft.com/office/word/2010/wordprocessingGroup" xmlns:wpi="http://schemas.microsoft.com/office/word/2010/wordprocessingInk" xmlns:wne="http://schemas.microsoft.com/office/word/2006/wordml" xmlns:wps="http://schemas.microsoft.com/office/word/2010/wordprocessingShape" mc:Ignorable="w14 w15 w16se w16cid w16 w16cex w16sdtdh w16sdtfl w16du wp14">
   <w:p>
     <w:pPr>
       <w:pStyle w:val="BodyText"/>
@@ -3619,7 +3604,7 @@
 </file>
 
 <file path=word/footnotes.xml><?xml version="1.0" encoding="utf-8"?>
-<w:footnotes xmlns:wpc="http://schemas.microsoft.com/office/word/2010/wordprocessingCanvas" xmlns:cx="http://schemas.microsoft.com/office/drawing/2014/chartex" xmlns:cx1="http://schemas.microsoft.com/office/drawing/2015/9/8/chartex" xmlns:cx2="http://schemas.microsoft.com/office/drawing/2015/10/21/chartex" xmlns:cx3="http://schemas.microsoft.com/office/drawing/2016/5/9/chartex" xmlns:cx4="http://schemas.microsoft.com/office/drawing/2016/5/10/chartex" xmlns:cx5="http://schemas.microsoft.com/office/drawing/2016/5/11/chartex" xmlns:cx6="http://schemas.microsoft.com/office/drawing/2016/5/12/chartex" xmlns:cx7="http://schemas.microsoft.com/office/drawing/2016/5/13/chartex" xmlns:cx8="http://schemas.microsoft.com/office/drawing/2016/5/14/chartex" xmlns:mc="http://schemas.openxmlformats.org/markup-compatibility/2006" xmlns:aink="http://schemas.microsoft.com/office/drawing/2016/ink" xmlns:am3d="http://schemas.microsoft.com/office/drawing/2017/model3d" xmlns:o="urn:schemas-microsoft-com:office:office" xmlns:oel="http://schemas.microsoft.com/office/2019/extlst" xmlns:r="http://schemas.openxmlformats.org/officeDocument/2006/relationships" xmlns:m="http://schemas.openxmlformats.org/officeDocument/2006/math" xmlns:v="urn:schemas-microsoft-com:vml" xmlns:wp14="http://schemas.microsoft.com/office/word/2010/wordprocessingDrawing" xmlns:wp="http://schemas.openxmlformats.org/drawingml/2006/wordprocessingDrawing" xmlns:w10="urn:schemas-microsoft-com:office:word" xmlns:w="http://schemas.openxmlformats.org/wordprocessingml/2006/main" xmlns:w14="http://schemas.microsoft.com/office/word/2010/wordml" xmlns:w15="http://schemas.microsoft.com/office/word/2012/wordml" xmlns:w16cei="http://schemas.microsoft.com/office/word/2026/wordml/cei" xmlns:w16cex="http://schemas.microsoft.com/office/word/2018/wordml/cex" xmlns:w16cid="http://schemas.microsoft.com/office/word/2016/wordml/cid" xmlns:w16="http://schemas.microsoft.com/office/word/2018/wordml" xmlns:w16du="http://schemas.microsoft.com/office/word/2023/wordml/word16du" xmlns:w16sdtdh="http://schemas.microsoft.com/office/word/2020/wordml/sdtdatahash" xmlns:w16sdtfl="http://schemas.microsoft.com/office/word/2024/wordml/sdtformatlock" xmlns:w16se="http://schemas.microsoft.com/office/word/2015/wordml/symex" xmlns:wpg="http://schemas.microsoft.com/office/word/2010/wordprocessingGroup" xmlns:wpi="http://schemas.microsoft.com/office/word/2010/wordprocessingInk" xmlns:wne="http://schemas.microsoft.com/office/word/2006/wordml" xmlns:wps="http://schemas.microsoft.com/office/word/2010/wordprocessingShape" mc:Ignorable="w14 w15 w16se w16cid w16 w16cex w16sdtdh w16sdtfl w16du wp14">
+<w:footnotes xmlns:wpc="http://schemas.microsoft.com/office/word/2010/wordprocessingCanvas" xmlns:cx="http://schemas.microsoft.com/office/drawing/2014/chartex" xmlns:cx1="http://schemas.microsoft.com/office/drawing/2015/9/8/chartex" xmlns:cx2="http://schemas.microsoft.com/office/drawing/2015/10/21/chartex" xmlns:cx3="http://schemas.microsoft.com/office/drawing/2016/5/9/chartex" xmlns:cx4="http://schemas.microsoft.com/office/drawing/2016/5/10/chartex" xmlns:cx5="http://schemas.microsoft.com/office/drawing/2016/5/11/chartex" xmlns:cx6="http://schemas.microsoft.com/office/drawing/2016/5/12/chartex" xmlns:cx7="http://schemas.microsoft.com/office/drawing/2016/5/13/chartex" xmlns:cx8="http://schemas.microsoft.com/office/drawing/2016/5/14/chartex" xmlns:mc="http://schemas.openxmlformats.org/markup-compatibility/2006" xmlns:aink="http://schemas.microsoft.com/office/drawing/2016/ink" xmlns:am3d="http://schemas.microsoft.com/office/drawing/2017/model3d" xmlns:o="urn:schemas-microsoft-com:office:office" xmlns:oel="http://schemas.microsoft.com/office/2019/extlst" xmlns:r="http://schemas.openxmlformats.org/officeDocument/2006/relationships" xmlns:m="http://schemas.openxmlformats.org/officeDocument/2006/math" xmlns:v="urn:schemas-microsoft-com:vml" xmlns:wp14="http://schemas.microsoft.com/office/word/2010/wordprocessingDrawing" xmlns:wp="http://schemas.openxmlformats.org/drawingml/2006/wordprocessingDrawing" xmlns:w10="urn:schemas-microsoft-com:office:word" xmlns:w="http://schemas.openxmlformats.org/wordprocessingml/2006/main" xmlns:w14="http://schemas.microsoft.com/office/word/2010/wordml" xmlns:w15="http://schemas.microsoft.com/office/word/2012/wordml" xmlns:w16cex="http://schemas.microsoft.com/office/word/2018/wordml/cex" xmlns:w16cid="http://schemas.microsoft.com/office/word/2016/wordml/cid" xmlns:w16="http://schemas.microsoft.com/office/word/2018/wordml" xmlns:w16du="http://schemas.microsoft.com/office/word/2023/wordml/word16du" xmlns:w16sdtdh="http://schemas.microsoft.com/office/word/2020/wordml/sdtdatahash" xmlns:w16sdtfl="http://schemas.microsoft.com/office/word/2024/wordml/sdtformatlock" xmlns:w16se="http://schemas.microsoft.com/office/word/2015/wordml/symex" xmlns:wpg="http://schemas.microsoft.com/office/word/2010/wordprocessingGroup" xmlns:wpi="http://schemas.microsoft.com/office/word/2010/wordprocessingInk" xmlns:wne="http://schemas.microsoft.com/office/word/2006/wordml" xmlns:wps="http://schemas.microsoft.com/office/word/2010/wordprocessingShape" mc:Ignorable="w14 w15 w16se w16cid w16 w16cex w16sdtdh w16sdtfl w16du wp14">
   <w:footnote w:type="separator" w:id="-1">
     <w:p>
       <w:r>

</xml_diff>